<commit_message>
Clean up main README for Week 2 release
Fix syllabus title to match week_2 content, drop the auto-grader
snippet from the top-level README, and pick up minor .gitignore/docx edits.
</commit_message>
<xml_diff>
--- a/week_2/Week1_Recap_Week2_Guide.docx
+++ b/week_2/Week1_Recap_Week2_Guide.docx
@@ -59,7 +59,35 @@
         <w:rPr>
           <w:sz w:val="24"/>
         </w:rPr>
-        <w:t>This guide walks through everything covered in Week 1 and introduces the new concepts for Week 2, with diagrams for each major idea. The goal is not just to finish the tasks and get a passing grade — it's to actually understand why each step matters, because that understanding is what carries over into every future project you touch, long after these specific tables are forgotten.</w:t>
+        <w:t xml:space="preserve">This guide walks through everything covered in Week 1 and introduces the new concepts for Week 2, with diagrams for each major idea. The goal is not just to finish the tasks and get a passing </w:t>
+      </w:r>
+      <w:proofErr w:type="gramStart"/>
+      <w:r>
+        <w:rPr>
+          <w:sz w:val="24"/>
+        </w:rPr>
+        <w:t>grade  it's</w:t>
+      </w:r>
+      <w:proofErr w:type="gramEnd"/>
+      <w:r>
+        <w:rPr>
+          <w:sz w:val="24"/>
+        </w:rPr>
+        <w:t xml:space="preserve"> to </w:t>
+      </w:r>
+      <w:proofErr w:type="gramStart"/>
+      <w:r>
+        <w:rPr>
+          <w:sz w:val="24"/>
+        </w:rPr>
+        <w:t>actually understand</w:t>
+      </w:r>
+      <w:proofErr w:type="gramEnd"/>
+      <w:r>
+        <w:rPr>
+          <w:sz w:val="24"/>
+        </w:rPr>
+        <w:t xml:space="preserve"> why each step matters, because that understanding is what carries over into every future project you touch, long after these specific tables are forgotten.</w:t>
       </w:r>
     </w:p>
     <w:p>
@@ -2149,13 +2177,22 @@
     </w:p>
     <w:p>
       <w:pPr>
+        <w:spacing w:after="120"/>
+      </w:pPr>
+    </w:p>
+    <w:p>
+      <w:pPr>
+        <w:spacing w:after="120"/>
+      </w:pPr>
+    </w:p>
+    <w:p>
+      <w:pPr>
         <w:pStyle w:val="Heading2"/>
       </w:pPr>
       <w:r>
         <w:rPr>
           <w:color w:val="1F2D5A"/>
         </w:rPr>
-        <w:lastRenderedPageBreak/>
         <w:t>Quick Quiz</w:t>
       </w:r>
     </w:p>

</xml_diff>